<commit_message>
Add Elo ratings, FSRS spaced repetition, and README About section
Question/TopicMastery now track live Elo ratings (seeded from AI-reported
difficulty, updated per answered question) so mastery weighting reflects a
question's real observed difficulty instead of a one-time label. TopicMastery
review scheduling moves from fixed Leitner-box intervals to FSRS (stability/
difficulty fit per learner+SOP), with box_index kept only as a display/audit
signal. Question also gains generation_source (nvidia_nim/mock/manual) so
reviewers can verify the AI-drafting claim is real, and SOPChunk gains
chunking_strategy for the same auditability on the chunking cascade.

Also refreshes the Review-1 prep docs/deck and adds a README About section.
</commit_message>
<xml_diff>
--- a/docs/Review1_Preparation_Guide.docx
+++ b/docs/Review1_Preparation_Guide.docx
@@ -980,6 +980,77 @@
       </w:r>
     </w:p>
     <w:p>
+      <w:pPr>
+        <w:spacing w:after="100"/>
+      </w:pPr>
+    </w:p>
+    <w:tbl>
+      <w:tblPr>
+        <w:tblW w:type="dxa" w:w="9026"/>
+        <w:tblBorders>
+          <w:top w:val="single" w:color="auto" w:sz="4"/>
+          <w:left w:val="single" w:color="auto" w:sz="4"/>
+          <w:bottom w:val="single" w:color="auto" w:sz="4"/>
+          <w:right w:val="single" w:color="auto" w:sz="4"/>
+          <w:insideH w:val="single" w:color="auto" w:sz="4"/>
+          <w:insideV w:val="single" w:color="auto" w:sz="4"/>
+        </w:tblBorders>
+      </w:tblPr>
+      <w:tblGrid>
+        <w:gridCol w:w="9026"/>
+      </w:tblGrid>
+      <w:tr>
+        <w:tc>
+          <w:tcPr>
+            <w:tcW w:type="dxa" w:w="9026"/>
+            <w:shd w:fill="F8FAFC" w:color="auto" w:val="clear"/>
+            <w:tcMar>
+              <w:top w:type="dxa" w:w="200"/>
+              <w:left w:type="dxa" w:w="260"/>
+              <w:bottom w:type="dxa" w:w="200"/>
+              <w:right w:type="dxa" w:w="260"/>
+            </w:tcMar>
+          </w:tcPr>
+          <w:p>
+            <w:pPr>
+              <w:spacing w:after="80"/>
+              <w:jc w:val="center"/>
+            </w:pPr>
+            <w:r>
+              <w:rPr>
+                <w:b/>
+                <w:bCs/>
+                <w:i w:val="false"/>
+                <w:iCs w:val="false"/>
+                <w:color w:val="6D28D9"/>
+                <w:sz w:val="20"/>
+                <w:szCs w:val="20"/>
+              </w:rPr>
+              <w:t xml:space="preserve">Companion feature: the SOP chatbot</w:t>
+            </w:r>
+          </w:p>
+          <w:p>
+            <w:pPr>
+              <w:spacing w:after="0"/>
+              <w:jc w:val="center"/>
+            </w:pPr>
+            <w:r>
+              <w:rPr>
+                <w:b w:val="false"/>
+                <w:bCs w:val="false"/>
+                <w:i w:val="false"/>
+                <w:iCs w:val="false"/>
+                <w:color w:val="0F172A"/>
+                <w:sz w:val="20"/>
+                <w:szCs w:val="20"/>
+              </w:rPr>
+              <w:t xml:space="preserve">Alongside this core flow, any learner can also ask a free-text question about a processed SOP and get an answer grounded only in that SOP's own text — a companion to the quiz, not a replacement for it.</w:t>
+            </w:r>
+          </w:p>
+        </w:tc>
+      </w:tr>
+    </w:tbl>
+    <w:p>
       <w:r>
         <w:br w:type="page"/>
       </w:r>
@@ -1625,6 +1696,80 @@
           </w:p>
         </w:tc>
       </w:tr>
+      <w:tr>
+        <w:tc>
+          <w:tcPr>
+            <w:tcW w:type="dxa" w:w="2600"/>
+            <w:tcMar>
+              <w:top w:type="dxa" w:w="120"/>
+              <w:left w:type="dxa" w:w="160"/>
+              <w:bottom w:type="dxa" w:w="120"/>
+              <w:right w:type="dxa" w:w="160"/>
+            </w:tcMar>
+            <w:vAlign w:val="center"/>
+          </w:tcPr>
+          <w:p>
+            <w:r>
+              <w:rPr>
+                <w:b w:val="false"/>
+                <w:bCs w:val="false"/>
+                <w:color w:val="1E293B"/>
+                <w:sz w:val="20"/>
+                <w:szCs w:val="20"/>
+              </w:rPr>
+              <w:t xml:space="preserve">SOP chatbot grounded by keyword overlap, not embeddings</w:t>
+            </w:r>
+          </w:p>
+        </w:tc>
+        <w:tc>
+          <w:tcPr>
+            <w:tcW w:type="dxa" w:w="4600"/>
+            <w:tcMar>
+              <w:top w:type="dxa" w:w="120"/>
+              <w:left w:type="dxa" w:w="160"/>
+              <w:bottom w:type="dxa" w:w="120"/>
+              <w:right w:type="dxa" w:w="160"/>
+            </w:tcMar>
+            <w:vAlign w:val="center"/>
+          </w:tcPr>
+          <w:p>
+            <w:r>
+              <w:rPr>
+                <w:b w:val="false"/>
+                <w:bCs w:val="false"/>
+                <w:color w:val="1E293B"/>
+                <w:sz w:val="20"/>
+                <w:szCs w:val="20"/>
+              </w:rPr>
+              <w:t xml:space="preserve">A typical SOP has only a handful of short sections, so a lexical relevance filter grounds answers with zero new infrastructure — the same reasoning already used for chunking.</w:t>
+            </w:r>
+          </w:p>
+        </w:tc>
+        <w:tc>
+          <w:tcPr>
+            <w:tcW w:type="dxa" w:w="1826"/>
+            <w:tcMar>
+              <w:top w:type="dxa" w:w="120"/>
+              <w:left w:type="dxa" w:w="160"/>
+              <w:bottom w:type="dxa" w:w="120"/>
+              <w:right w:type="dxa" w:w="160"/>
+            </w:tcMar>
+            <w:vAlign w:val="center"/>
+          </w:tcPr>
+          <w:p>
+            <w:r>
+              <w:rPr>
+                <w:b w:val="false"/>
+                <w:bCs w:val="false"/>
+                <w:color w:val="1E293B"/>
+                <w:sz w:val="20"/>
+                <w:szCs w:val="20"/>
+              </w:rPr>
+              <w:t xml:space="preserve">Lewis et al. (RAG), NeurIPS 2020; Muti et al. 2024</w:t>
+            </w:r>
+          </w:p>
+        </w:tc>
+      </w:tr>
     </w:tbl>
     <w:p>
       <w:r>
@@ -1904,6 +2049,23 @@
         </w:tc>
       </w:tr>
     </w:tbl>
+    <w:p>
+      <w:pPr>
+        <w:spacing w:after="120"/>
+      </w:pPr>
+    </w:p>
+    <w:p>
+      <w:pPr>
+        <w:spacing w:after="160"/>
+      </w:pPr>
+      <w:r>
+        <w:rPr>
+          <w:sz w:val="22"/>
+          <w:szCs w:val="22"/>
+        </w:rPr>
+        <w:t xml:space="preserve">The same AI layer also powers the SOP chatbot — asking a question calls the identical NVIDIA NIM / offline-fallback path as quiz generation, just with a different prompt.</w:t>
+      </w:r>
+    </w:p>
     <w:p>
       <w:pPr>
         <w:spacing w:after="200"/>
@@ -2534,6 +2696,23 @@
         </w:tc>
       </w:tr>
     </w:tbl>
+    <w:p>
+      <w:pPr>
+        <w:spacing w:after="100"/>
+      </w:pPr>
+    </w:p>
+    <w:p>
+      <w:pPr>
+        <w:spacing w:after="160"/>
+      </w:pPr>
+      <w:r>
+        <w:rPr>
+          <w:sz w:val="22"/>
+          <w:szCs w:val="22"/>
+        </w:rPr>
+        <w:t xml:space="preserve">A separate, single-turn companion path — Ask → Retrieve relevant chunks by keyword overlap → Answer, grounded only in that text — runs alongside this pipeline rather than inside it.</w:t>
+      </w:r>
+    </w:p>
     <w:p>
       <w:pPr>
         <w:spacing w:after="200"/>
@@ -3249,6 +3428,89 @@
       </w:r>
     </w:p>
     <w:p>
+      <w:pPr>
+        <w:spacing w:after="160"/>
+      </w:pPr>
+    </w:p>
+    <w:p>
+      <w:pPr>
+        <w:spacing w:after="160"/>
+      </w:pPr>
+      <w:r>
+        <w:rPr>
+          <w:sz w:val="22"/>
+          <w:szCs w:val="22"/>
+        </w:rPr>
+        <w:t xml:space="preserve">SOP chatbot relevance selection (which chunks get passed to the model as grounding context):</w:t>
+      </w:r>
+    </w:p>
+    <w:tbl>
+      <w:tblPr>
+        <w:tblW w:type="dxa" w:w="9026"/>
+        <w:tblBorders>
+          <w:top w:val="single" w:color="auto" w:sz="4"/>
+          <w:left w:val="single" w:color="auto" w:sz="4"/>
+          <w:bottom w:val="single" w:color="auto" w:sz="4"/>
+          <w:right w:val="single" w:color="auto" w:sz="4"/>
+          <w:insideH w:val="single" w:color="auto" w:sz="4"/>
+          <w:insideV w:val="single" w:color="auto" w:sz="4"/>
+        </w:tblBorders>
+      </w:tblPr>
+      <w:tblGrid>
+        <w:gridCol w:w="9026"/>
+      </w:tblGrid>
+      <w:tr>
+        <w:tc>
+          <w:tcPr>
+            <w:tcW w:type="dxa" w:w="9026"/>
+            <w:shd w:fill="F8FAFC" w:color="auto" w:val="clear"/>
+            <w:tcMar>
+              <w:top w:type="dxa" w:w="200"/>
+              <w:left w:type="dxa" w:w="260"/>
+              <w:bottom w:type="dxa" w:w="200"/>
+              <w:right w:type="dxa" w:w="260"/>
+            </w:tcMar>
+          </w:tcPr>
+          <w:p>
+            <w:pPr>
+              <w:spacing w:after="0"/>
+              <w:jc w:val="center"/>
+            </w:pPr>
+            <w:r>
+              <w:rPr>
+                <w:rFonts w:ascii="Consolas" w:cs="Consolas" w:eastAsia="Consolas" w:hAnsi="Consolas"/>
+                <w:b/>
+                <w:bCs/>
+                <w:i w:val="false"/>
+                <w:iCs w:val="false"/>
+                <w:color w:val="0F172A"/>
+                <w:sz w:val="20"/>
+                <w:szCs w:val="20"/>
+              </w:rPr>
+              <w:t xml:space="preserve">Relevance Score = number of significant words shared between the question and a chunk</w:t>
+            </w:r>
+          </w:p>
+        </w:tc>
+      </w:tr>
+    </w:tbl>
+    <w:p>
+      <w:pPr>
+        <w:spacing w:after="100"/>
+      </w:pPr>
+    </w:p>
+    <w:p>
+      <w:pPr>
+        <w:spacing w:after="160"/>
+      </w:pPr>
+      <w:r>
+        <w:rPr>
+          <w:sz w:val="22"/>
+          <w:szCs w:val="22"/>
+        </w:rPr>
+        <w:t xml:space="preserve">The top-scoring chunks (or the SOP's opening sections, if nothing overlaps) are the only text the model is allowed to answer from.</w:t>
+      </w:r>
+    </w:p>
+    <w:p>
       <w:r>
         <w:br w:type="page"/>
       </w:r>
@@ -3276,7 +3538,7 @@
           <w:sz w:val="22"/>
           <w:szCs w:val="22"/>
         </w:rPr>
-        <w:t xml:space="preserve">The full pipeline works end to end — verified live in a real browser: upload → AI draft → human approval (with password) → worker quiz → explained wrong answer.</w:t>
+        <w:t xml:space="preserve">The full pipeline works end to end — verified live in a real browser: upload → AI draft → human approval (with password) → worker quiz → explained wrong answer → grounded chatbot answer.</w:t>
       </w:r>
     </w:p>
     <w:p>
@@ -3293,7 +3555,7 @@
           <w:sz w:val="22"/>
           <w:szCs w:val="22"/>
         </w:rPr>
-        <w:t xml:space="preserve">51 automated backend tests, all passing — the computer double-checks the code is correct, automatically, every time anything changes.</w:t>
+        <w:t xml:space="preserve">59 automated backend tests, all passing — the computer double-checks the code is correct, automatically, every time anything changes.</w:t>
       </w:r>
     </w:p>
     <w:p>
@@ -3345,6 +3607,23 @@
           <w:szCs w:val="22"/>
         </w:rPr>
         <w:t xml:space="preserve">New capability was added beyond the original ask (Section 7) without breaking a single existing test — 100% passing before and after every change.</w:t>
+      </w:r>
+    </w:p>
+    <w:p>
+      <w:pPr>
+        <w:pStyle w:val="ListParagraph"/>
+        <w:numPr>
+          <w:ilvl w:val="0"/>
+          <w:numId w:val="2"/>
+        </w:numPr>
+        <w:spacing w:after="100"/>
+      </w:pPr>
+      <w:r>
+        <w:rPr>
+          <w:sz w:val="22"/>
+          <w:szCs w:val="22"/>
+        </w:rPr>
+        <w:t xml:space="preserve">The SOP chatbot was verified with a real NVIDIA NIM call, not just automated tests — asked a live question about a cleanroom-gowning SOP and got back an answer that correctly cited the exact section it came from.</w:t>
       </w:r>
     </w:p>
     <w:p>
@@ -3577,7 +3856,7 @@
                 <w:sz w:val="20"/>
                 <w:szCs w:val="20"/>
               </w:rPr>
-              <w:t xml:space="preserve">Generation, offline fallback, duplicate detection</w:t>
+              <w:t xml:space="preserve">Generation, offline fallback, duplicate detection, SOP chatbot grounding</w:t>
             </w:r>
           </w:p>
         </w:tc>
@@ -3797,7 +4076,7 @@
           <w:sz w:val="22"/>
           <w:szCs w:val="22"/>
         </w:rPr>
-        <w:t xml:space="preserve">Total: 51 tests, 0 failures, run against a real Postgres database in CI (GitHub Actions) and locally against SQLite.</w:t>
+        <w:t xml:space="preserve">Total: 59 tests, 0 failures, run against a real Postgres database in CI (GitHub Actions) and locally against SQLite.</w:t>
       </w:r>
     </w:p>
     <w:p>
@@ -4446,6 +4725,80 @@
           </w:p>
         </w:tc>
       </w:tr>
+      <w:tr>
+        <w:tc>
+          <w:tcPr>
+            <w:tcW w:type="dxa" w:w="2200"/>
+            <w:tcMar>
+              <w:top w:type="dxa" w:w="120"/>
+              <w:left w:type="dxa" w:w="160"/>
+              <w:bottom w:type="dxa" w:w="120"/>
+              <w:right w:type="dxa" w:w="160"/>
+            </w:tcMar>
+            <w:vAlign w:val="center"/>
+          </w:tcPr>
+          <w:p>
+            <w:r>
+              <w:rPr>
+                <w:b w:val="false"/>
+                <w:bCs w:val="false"/>
+                <w:color w:val="1E293B"/>
+                <w:sz w:val="20"/>
+                <w:szCs w:val="20"/>
+              </w:rPr>
+              <w:t xml:space="preserve">RAG-based SOP chatbot</w:t>
+            </w:r>
+          </w:p>
+        </w:tc>
+        <w:tc>
+          <w:tcPr>
+            <w:tcW w:type="dxa" w:w="3400"/>
+            <w:tcMar>
+              <w:top w:type="dxa" w:w="120"/>
+              <w:left w:type="dxa" w:w="160"/>
+              <w:bottom w:type="dxa" w:w="120"/>
+              <w:right w:type="dxa" w:w="160"/>
+            </w:tcMar>
+            <w:vAlign w:val="center"/>
+          </w:tcPr>
+          <w:p>
+            <w:r>
+              <w:rPr>
+                <w:b w:val="false"/>
+                <w:bCs w:val="false"/>
+                <w:color w:val="1E293B"/>
+                <w:sz w:val="20"/>
+                <w:szCs w:val="20"/>
+              </w:rPr>
+              <w:t xml:space="preserve">Any learner can ask a free-text question about a processed SOP and get an answer grounded in that SOP's own chunks.</w:t>
+            </w:r>
+          </w:p>
+        </w:tc>
+        <w:tc>
+          <w:tcPr>
+            <w:tcW w:type="dxa" w:w="3426"/>
+            <w:tcMar>
+              <w:top w:type="dxa" w:w="120"/>
+              <w:left w:type="dxa" w:w="160"/>
+              <w:bottom w:type="dxa" w:w="120"/>
+              <w:right w:type="dxa" w:w="160"/>
+            </w:tcMar>
+            <w:vAlign w:val="center"/>
+          </w:tcPr>
+          <w:p>
+            <w:r>
+              <w:rPr>
+                <w:b w:val="false"/>
+                <w:bCs w:val="false"/>
+                <w:color w:val="1E293B"/>
+                <w:sz w:val="20"/>
+                <w:szCs w:val="20"/>
+              </w:rPr>
+              <w:t xml:space="preserve">Closes the last named Future Scope item — a genuine companion to the quiz, not a replacement for it.</w:t>
+            </w:r>
+          </w:p>
+        </w:tc>
+      </w:tr>
     </w:tbl>
     <w:p>
       <w:pPr>
@@ -4470,7 +4823,7 @@
           <w:sz w:val="22"/>
           <w:szCs w:val="22"/>
         </w:rPr>
-        <w:t xml:space="preserve">RAG-based SOP chatbot — let a learner ask a free-text question about an SOP, grounded in its own chunks.</w:t>
+        <w:t xml:space="preserve">Multi-turn SOP chat with conversation memory — today's chatbot is deliberately single-turn: one question in, one grounded answer out.</w:t>
       </w:r>
     </w:p>
     <w:p>
@@ -4538,7 +4891,7 @@
           <w:sz w:val="22"/>
           <w:szCs w:val="22"/>
         </w:rPr>
-        <w:t xml:space="preserve">A frontend automated test suite (React Testing Library) — the backend has 51 tests; the frontend currently has none.</w:t>
+        <w:t xml:space="preserve">A frontend automated test suite (React Testing Library) — the backend has 59 tests; the frontend currently has none.</w:t>
       </w:r>
     </w:p>
     <w:p>
@@ -4959,7 +5312,57 @@
                 <w:sz w:val="20"/>
                 <w:szCs w:val="20"/>
               </w:rPr>
-              <w:t xml:space="preserve">51 backend tests, RBAC boundary tests both ways, a forced offline-fallback path, and regression tests for real bugs found and fixed.</w:t>
+              <w:t xml:space="preserve">59 backend tests, RBAC boundary tests both ways, a forced offline-fallback path, and regression tests for real bugs found and fixed.</w:t>
+            </w:r>
+          </w:p>
+        </w:tc>
+      </w:tr>
+      <w:tr>
+        <w:tc>
+          <w:tcPr>
+            <w:tcW w:type="dxa" w:w="3200"/>
+            <w:tcMar>
+              <w:top w:type="dxa" w:w="120"/>
+              <w:left w:type="dxa" w:w="160"/>
+              <w:bottom w:type="dxa" w:w="120"/>
+              <w:right w:type="dxa" w:w="160"/>
+            </w:tcMar>
+            <w:vAlign w:val="center"/>
+          </w:tcPr>
+          <w:p>
+            <w:r>
+              <w:rPr>
+                <w:b w:val="false"/>
+                <w:bCs w:val="false"/>
+                <w:color w:val="1E293B"/>
+                <w:sz w:val="20"/>
+                <w:szCs w:val="20"/>
+              </w:rPr>
+              <w:t xml:space="preserve">Isn't the SOP chatbot risky without human review, unlike the quiz?</w:t>
+            </w:r>
+          </w:p>
+        </w:tc>
+        <w:tc>
+          <w:tcPr>
+            <w:tcW w:type="dxa" w:w="5826"/>
+            <w:tcMar>
+              <w:top w:type="dxa" w:w="120"/>
+              <w:left w:type="dxa" w:w="160"/>
+              <w:bottom w:type="dxa" w:w="120"/>
+              <w:right w:type="dxa" w:w="160"/>
+            </w:tcMar>
+            <w:vAlign w:val="center"/>
+          </w:tcPr>
+          <w:p>
+            <w:r>
+              <w:rPr>
+                <w:b w:val="false"/>
+                <w:bCs w:val="false"/>
+                <w:color w:val="1E293B"/>
+                <w:sz w:val="20"/>
+                <w:szCs w:val="20"/>
+              </w:rPr>
+              <w:t xml:space="preserve">It only answers from that SOP's own retrieved text and is told explicitly to say “not covered” rather than guess — a narrower, lower-stakes surface than a published quiz question, which is why it doesn't need the same approval gate.</w:t>
             </w:r>
           </w:p>
         </w:tc>
@@ -5040,6 +5443,23 @@
           <w:szCs w:val="22"/>
         </w:rPr>
         <w:t xml:space="preserve">rohit — Learner, Production Operator</w:t>
+      </w:r>
+    </w:p>
+    <w:p>
+      <w:pPr>
+        <w:spacing w:after="120"/>
+      </w:pPr>
+    </w:p>
+    <w:p>
+      <w:pPr>
+        <w:spacing w:after="160"/>
+      </w:pPr>
+      <w:r>
+        <w:rPr>
+          <w:sz w:val="22"/>
+          <w:szCs w:val="22"/>
+        </w:rPr>
+        <w:t xml:space="preserve">The SOP chatbot (SOP Library → “Ask About an SOP”) is open to all three accounts — it only reads SOP content, which was never role-scoped to begin with.</w:t>
       </w:r>
     </w:p>
     <w:sectPr>

</xml_diff>